<commit_message>
docs: add project structure documentation and update existing file
</commit_message>
<xml_diff>
--- a/project_structure.docx
+++ b/project_structure.docx
@@ -18,6 +18,498 @@
         </w:rPr>
         <w:t>conf-platform</w:t>
         <w:br/>
+        <w:t>├── apps</w:t>
+        <w:br/>
+        <w:t>│   ├── cloud</w:t>
+        <w:br/>
+        <w:t>│   │   ├── organizer-portal</w:t>
+        <w:br/>
+        <w:t>│   │   │   ├── app</w:t>
+        <w:br/>
+        <w:t>│   │   │   │   ├── (auth)</w:t>
+        <w:br/>
+        <w:t>│   │   │   │   │   ├── layout.tsx</w:t>
+        <w:br/>
+        <w:t>│   │   │   │   │   └── page.tsx</w:t>
+        <w:br/>
+        <w:t>│   │   │   │   ├── (dashboard)</w:t>
+        <w:br/>
+        <w:t>│   │   │   │   │   ├── analytics</w:t>
+        <w:br/>
+        <w:t>│   │   │   │   │   │   └── page.tsx</w:t>
+        <w:br/>
+        <w:t>│   │   │   │   │   ├── connections</w:t>
+        <w:br/>
+        <w:t>│   │   │   │   │   │   └── page.tsx</w:t>
+        <w:br/>
+        <w:t>│   │   │   │   │   ├── dashboard</w:t>
+        <w:br/>
+        <w:t>│   │   │   │   │   │   └── page.tsx</w:t>
+        <w:br/>
+        <w:t>│   │   │   │   │   ├── docs</w:t>
+        <w:br/>
+        <w:t>│   │   │   │   │   │   └── page.tsx</w:t>
+        <w:br/>
+        <w:t>│   │   │   │   │   ├── events</w:t>
+        <w:br/>
+        <w:t>│   │   │   │   │   │   ├── [eventId]</w:t>
+        <w:br/>
+        <w:t>│   │   │   │   │   │   │   ├── dashboard</w:t>
+        <w:br/>
+        <w:t>│   │   │   │   │   │   │   │   └── page.tsx</w:t>
+        <w:br/>
+        <w:t>│   │   │   │   │   │   │   ├── registration</w:t>
+        <w:br/>
+        <w:t>│   │   │   │   │   │   │   │   ├── capacity</w:t>
+        <w:br/>
+        <w:t>│   │   │   │   │   │   │   │   │   └── page.tsx</w:t>
+        <w:br/>
+        <w:t>│   │   │   │   │   │   │   │   ├── certificates</w:t>
+        <w:br/>
+        <w:t>│   │   │   │   │   │   │   │   │   └── page.tsx</w:t>
+        <w:br/>
+        <w:t>│   │   │   │   │   │   │   │   ├── dashboard</w:t>
+        <w:br/>
+        <w:t>│   │   │   │   │   │   │   │   │   └── page.tsx</w:t>
+        <w:br/>
+        <w:t>│   │   │   │   │   │   │   │   ├── designer</w:t>
+        <w:br/>
+        <w:t>│   │   │   │   │   │   │   │   │   └── page.tsx</w:t>
+        <w:br/>
+        <w:t>│   │   │   │   │   │   │   │   ├── emails</w:t>
+        <w:br/>
+        <w:t>│   │   │   │   │   │   │   │   │   └── page.tsx</w:t>
+        <w:br/>
+        <w:t>│   │   │   │   │   │   │   │   ├── form-builder</w:t>
+        <w:br/>
+        <w:t>│   │   │   │   │   │   │   │   │   └── page.tsx</w:t>
+        <w:br/>
+        <w:t>│   │   │   │   │   │   │   │   ├── participants</w:t>
+        <w:br/>
+        <w:t>│   │   │   │   │   │   │   │   │   └── page.tsx</w:t>
+        <w:br/>
+        <w:t>│   │   │   │   │   │   │   │   ├── print-queue</w:t>
+        <w:br/>
+        <w:t>│   │   │   │   │   │   │   │   │   └── page.tsx</w:t>
+        <w:br/>
+        <w:t>│   │   │   │   │   │   │   │   ├── register</w:t>
+        <w:br/>
+        <w:t>│   │   │   │   │   │   │   │   │   └── page.tsx</w:t>
+        <w:br/>
+        <w:t>│   │   │   │   │   │   │   │   ├── reports</w:t>
+        <w:br/>
+        <w:t>│   │   │   │   │   │   │   │   │   └── page.tsx</w:t>
+        <w:br/>
+        <w:t>│   │   │   │   │   │   │   │   ├── review</w:t>
+        <w:br/>
+        <w:t>│   │   │   │   │   │   │   │   │   └── page.tsx</w:t>
+        <w:br/>
+        <w:t>│   │   │   │   │   │   │   │   ├── settings</w:t>
+        <w:br/>
+        <w:t>│   │   │   │   │   │   │   │   │   └── page.tsx</w:t>
+        <w:br/>
+        <w:t>│   │   │   │   │   │   │   │   └── page.tsx</w:t>
+        <w:br/>
+        <w:t>│   │   │   │   │   │   │   ├── speaker</w:t>
+        <w:br/>
+        <w:t>│   │   │   │   │   │   │   │   ├── analytics</w:t>
+        <w:br/>
+        <w:t>│   │   │   │   │   │   │   │   │   └── page.tsx</w:t>
+        <w:br/>
+        <w:t>│   │   │   │   │   │   │   │   ├── configuration</w:t>
+        <w:br/>
+        <w:t>│   │   │   │   │   │   │   │   │   └── page.tsx</w:t>
+        <w:br/>
+        <w:t>│   │   │   │   │   │   │   │   ├── dashboard</w:t>
+        <w:br/>
+        <w:t>│   │   │   │   │   │   │   │   │   └── page.tsx</w:t>
+        <w:br/>
+        <w:t>│   │   │   │   │   │   │   │   ├── emails</w:t>
+        <w:br/>
+        <w:t>│   │   │   │   │   │   │   │   │   └── page.tsx</w:t>
+        <w:br/>
+        <w:t>│   │   │   │   │   │   │   │   ├── eposters</w:t>
+        <w:br/>
+        <w:t>│   │   │   │   │   │   │   │   │   └── page.tsx</w:t>
+        <w:br/>
+        <w:t>│   │   │   │   │   │   │   │   ├── files</w:t>
+        <w:br/>
+        <w:t>│   │   │   │   │   │   │   │   │   └── page.tsx</w:t>
+        <w:br/>
+        <w:t>│   │   │   │   │   │   │   │   ├── notifications</w:t>
+        <w:br/>
+        <w:t>│   │   │   │   │   │   │   │   │   └── page.tsx</w:t>
+        <w:br/>
+        <w:t>│   │   │   │   │   │   │   │   ├── rooms</w:t>
+        <w:br/>
+        <w:t>│   │   │   │   │   │   │   │   │   └── page.tsx</w:t>
+        <w:br/>
+        <w:t>│   │   │   │   │   │   │   │   ├── sessions</w:t>
+        <w:br/>
+        <w:t>│   │   │   │   │   │   │   │   │   └── page.tsx</w:t>
+        <w:br/>
+        <w:t>│   │   │   │   │   │   │   │   ├── settings</w:t>
+        <w:br/>
+        <w:t>│   │   │   │   │   │   │   │   │   └── page.tsx</w:t>
+        <w:br/>
+        <w:t>│   │   │   │   │   │   │   │   ├── speakers</w:t>
+        <w:br/>
+        <w:t>│   │   │   │   │   │   │   │   │   └── page.tsx</w:t>
+        <w:br/>
+        <w:t>│   │   │   │   │   │   │   │   └── page.tsx</w:t>
+        <w:br/>
+        <w:t>│   │   │   │   │   │   │   └── page.tsx</w:t>
+        <w:br/>
+        <w:t>│   │   │   │   │   │   ├── new</w:t>
+        <w:br/>
+        <w:t>│   │   │   │   │   │   │   └── page.tsx</w:t>
+        <w:br/>
+        <w:t>│   │   │   │   │   │   └── page.tsx</w:t>
+        <w:br/>
+        <w:t>│   │   │   │   │   ├── settings</w:t>
+        <w:br/>
+        <w:t>│   │   │   │   │   │   └── page.tsx</w:t>
+        <w:br/>
+        <w:t>│   │   │   │   │   ├── users</w:t>
+        <w:br/>
+        <w:t>│   │   │   │   │   │   └── page.tsx</w:t>
+        <w:br/>
+        <w:t>│   │   │   │   │   └── layout.tsx</w:t>
+        <w:br/>
+        <w:t>│   │   │   │   ├── globals.css</w:t>
+        <w:br/>
+        <w:t>│   │   │   │   ├── layout.tsx</w:t>
+        <w:br/>
+        <w:t>│   │   │   │   └── not-found.tsx</w:t>
+        <w:br/>
+        <w:t>│   │   │   ├── components</w:t>
+        <w:br/>
+        <w:t>│   │   │   │   ├── auth</w:t>
+        <w:br/>
+        <w:t>│   │   │   │   │   └── PermissionGate.tsx</w:t>
+        <w:br/>
+        <w:t>│   │   │   │   ├── dashboard</w:t>
+        <w:br/>
+        <w:t>│   │   │   │   │   ├── DailyUploadsChart.tsx</w:t>
+        <w:br/>
+        <w:t>│   │   │   │   │   ├── LiveFeed.tsx</w:t>
+        <w:br/>
+        <w:t>│   │   │   │   │   ├── ReadinessHeatmap.tsx</w:t>
+        <w:br/>
+        <w:t>│   │   │   │   │   ├── RecentActivity.tsx</w:t>
+        <w:br/>
+        <w:t>│   │   │   │   │   ├── RoomReadinessChart.tsx</w:t>
+        <w:br/>
+        <w:t>│   │   │   │   │   ├── StatsGrid.tsx</w:t>
+        <w:br/>
+        <w:t>│   │   │   │   │   └── UploadProgressChart.tsx</w:t>
+        <w:br/>
+        <w:t>│   │   │   │   ├── emails</w:t>
+        <w:br/>
+        <w:t>│   │   │   │   │   ├── campaign</w:t>
+        <w:br/>
+        <w:t>│   │   │   │   │   │   ├── CampaignBuilder.tsx</w:t>
+        <w:br/>
+        <w:t>│   │   │   │   │   │   ├── CampaignDetail.tsx</w:t>
+        <w:br/>
+        <w:t>│   │   │   │   │   │   ├── CampaignList.tsx</w:t>
+        <w:br/>
+        <w:t>│   │   │   │   │   │   └── RegistrationCampaignBuilder.tsx</w:t>
+        <w:br/>
+        <w:t>│   │   │   │   │   ├── dashboard</w:t>
+        <w:br/>
+        <w:t>│   │   │   │   │   │   ├── AnalyticsDashboard.tsx</w:t>
+        <w:br/>
+        <w:t>│   │   │   │   │   │   └── CampaignDashboard.tsx</w:t>
+        <w:br/>
+        <w:t>│   │   │   │   │   ├── logs</w:t>
+        <w:br/>
+        <w:t>│   │   │   │   │   │   └── LogsTable.tsx</w:t>
+        <w:br/>
+        <w:t>│   │   │   │   │   ├── templates</w:t>
+        <w:br/>
+        <w:t>│   │   │   │   │   │   ├── RegistrationTemplateEditor.tsx</w:t>
+        <w:br/>
+        <w:t>│   │   │   │   │   │   ├── TemplateEditor.tsx</w:t>
+        <w:br/>
+        <w:t>│   │   │   │   │   │   ├── TemplatePreview.tsx</w:t>
+        <w:br/>
+        <w:t>│   │   │   │   │   │   └── VariablePanel.tsx</w:t>
+        <w:br/>
+        <w:t>│   │   │   │   │   └── EmailCampaignManager.tsx</w:t>
+        <w:br/>
+        <w:t>│   │   │   │   ├── eposters</w:t>
+        <w:br/>
+        <w:t>│   │   │   │   │   └── ManageScreensDialog.tsx</w:t>
+        <w:br/>
+        <w:t>│   │   │   │   ├── events</w:t>
+        <w:br/>
+        <w:t>│   │   │   │   │   └── EventConfigurationWorkspace.tsx</w:t>
+        <w:br/>
+        <w:t>│   │   │   │   ├── files</w:t>
+        <w:br/>
+        <w:t>│   │   │   │   │   ├── ApprovalActions.tsx</w:t>
+        <w:br/>
+        <w:t>│   │   │   │   │   ├── FilePreviewPanel.tsx</w:t>
+        <w:br/>
+        <w:t>│   │   │   │   │   └── FileTable.tsx</w:t>
+        <w:br/>
+        <w:t>│   │   │   │   ├── import</w:t>
+        <w:br/>
+        <w:t>│   │   │   │   │   ├── ColumnMapper.tsx</w:t>
+        <w:br/>
+        <w:t>│   │   │   │   │   ├── ImportPreview.tsx</w:t>
+        <w:br/>
+        <w:t>│   │   │   │   │   └── ImportWizard.tsx</w:t>
+        <w:br/>
+        <w:t>│   │   │   │   ├── layout</w:t>
+        <w:br/>
+        <w:t>│   │   │   │   │   ├── EventSelector.tsx</w:t>
+        <w:br/>
+        <w:t>│   │   │   │   │   ├── Header.tsx</w:t>
+        <w:br/>
+        <w:t>│   │   │   │   │   ├── PageHeader.tsx</w:t>
+        <w:br/>
+        <w:t>│   │   │   │   │   ├── PageWrapper.tsx</w:t>
+        <w:br/>
+        <w:t>│   │   │   │   │   ├── Sidebar.tsx</w:t>
+        <w:br/>
+        <w:t>│   │   │   │   │   └── ThemeControls.tsx</w:t>
+        <w:br/>
+        <w:t>│   │   │   │   ├── modals</w:t>
+        <w:br/>
+        <w:t>│   │   │   │   │   └── GlobalModal.tsx</w:t>
+        <w:br/>
+        <w:t>│   │   │   │   ├── notifications</w:t>
+        <w:br/>
+        <w:t>│   │   │   │   │   ├── CampaignTable.tsx</w:t>
+        <w:br/>
+        <w:t>│   │   │   │   │   └── TemplateEditor.tsx</w:t>
+        <w:br/>
+        <w:t>│   │   │   │   ├── rbac</w:t>
+        <w:br/>
+        <w:t>│   │   │   │   │   ├── CreateUserDialog.tsx</w:t>
+        <w:br/>
+        <w:t>│   │   │   │   │   ├── ManageNodeDialog.tsx</w:t>
+        <w:br/>
+        <w:t>│   │   │   │   │   └── UserManagement.tsx</w:t>
+        <w:br/>
+        <w:t>│   │   │   │   ├── ready-room</w:t>
+        <w:br/>
+        <w:t>│   │   │   │   │   ├── CheckInPanel.tsx</w:t>
+        <w:br/>
+        <w:t>│   │   │   │   │   └── StationGrid.tsx</w:t>
+        <w:br/>
+        <w:t>│   │   │   │   ├── registration</w:t>
+        <w:br/>
+        <w:t>│   │   │   │   │   └── settings</w:t>
+        <w:br/>
+        <w:t>│   │   │   │   │       ├── AccessTab.tsx</w:t>
+        <w:br/>
+        <w:t>│   │   │   │   │       ├── PortalTab.tsx</w:t>
+        <w:br/>
+        <w:t>│   │   │   │   │       ├── PricingTab.tsx</w:t>
+        <w:br/>
+        <w:t>│   │   │   │   │       └── RolesTab.tsx</w:t>
+        <w:br/>
+        <w:t>│   │   │   │   ├── rooms</w:t>
+        <w:br/>
+        <w:t>│   │   │   │   │   └── CreateRoomDialog.tsx</w:t>
+        <w:br/>
+        <w:t>│   │   │   │   ├── sessions</w:t>
+        <w:br/>
+        <w:t>│   │   │   │   │   ├── CalendarView.tsx</w:t>
+        <w:br/>
+        <w:t>│   │   │   │   │   ├── CreateSessionDialog.tsx</w:t>
+        <w:br/>
+        <w:t>│   │   │   │   │   ├── DatePicker.tsx</w:t>
+        <w:br/>
+        <w:t>│   │   │   │   │   ├── ScheduleGrid.tsx</w:t>
+        <w:br/>
+        <w:t>│   │   │   │   │   ├── SessionDetailDialog.tsx</w:t>
+        <w:br/>
+        <w:t>│   │   │   │   │   ├── SessionForm.tsx</w:t>
+        <w:br/>
+        <w:t>│   │   │   │   │   ├── SessionTable.tsx</w:t>
+        <w:br/>
+        <w:t>│   │   │   │   │   └── TimelineView.tsx</w:t>
+        <w:br/>
+        <w:t>│   │   │   │   ├── speakers</w:t>
+        <w:br/>
+        <w:t>│   │   │   │   │   ├── EmailCampaignDialog.tsx</w:t>
+        <w:br/>
+        <w:t>│   │   │   │   │   ├── InviteModal.tsx</w:t>
+        <w:br/>
+        <w:t>│   │   │   │   │   ├── MoveTalkDialog.tsx</w:t>
+        <w:br/>
+        <w:t>│   │   │   │   │   ├── RegisterSpeakerDialog.tsx</w:t>
+        <w:br/>
+        <w:t>│   │   │   │   │   ├── SpeakerDrawer.tsx</w:t>
+        <w:br/>
+        <w:t>│   │   │   │   │   ├── SpeakerTable.tsx</w:t>
+        <w:br/>
+        <w:t>│   │   │   │   │   └── StatusBadge.tsx</w:t>
+        <w:br/>
+        <w:t>│   │   │   │   ├── ui</w:t>
+        <w:br/>
+        <w:t>│   │   │   │   │   ├── avatar.tsx</w:t>
+        <w:br/>
+        <w:t>│   │   │   │   │   ├── badge.tsx</w:t>
+        <w:br/>
+        <w:t>│   │   │   │   │   ├── button.tsx</w:t>
+        <w:br/>
+        <w:t>│   │   │   │   │   ├── card.tsx</w:t>
+        <w:br/>
+        <w:t>│   │   │   │   │   ├── dialog.tsx</w:t>
+        <w:br/>
+        <w:t>│   │   │   │   │   ├── dropdown-menu.tsx</w:t>
+        <w:br/>
+        <w:t>│   │   │   │   │   ├── input.tsx</w:t>
+        <w:br/>
+        <w:t>│   │   │   │   │   ├── label.tsx</w:t>
+        <w:br/>
+        <w:t>│   │   │   │   │   ├── portal.tsx</w:t>
+        <w:br/>
+        <w:t>│   │   │   │   │   ├── README.md</w:t>
+        <w:br/>
+        <w:t>│   │   │   │   │   ├── scroll-area.tsx</w:t>
+        <w:br/>
+        <w:t>│   │   │   │   │   ├── select.tsx</w:t>
+        <w:br/>
+        <w:t>│   │   │   │   │   ├── skeleton.tsx</w:t>
+        <w:br/>
+        <w:t>│   │   │   │   │   ├── switch.tsx</w:t>
+        <w:br/>
+        <w:t>│   │   │   │   │   ├── tabs.tsx</w:t>
+        <w:br/>
+        <w:t>│   │   │   │   │   ├── textarea.tsx</w:t>
+        <w:br/>
+        <w:t>│   │   │   │   │   └── Tooltip.tsx</w:t>
+        <w:br/>
+        <w:t>│   │   │   │   ├── CreateEventDialog.tsx</w:t>
+        <w:br/>
+        <w:t>│   │   │   │   ├── FloatingToolbar.tsx</w:t>
+        <w:br/>
+        <w:t>│   │   │   │   ├── providers.tsx</w:t>
+        <w:br/>
+        <w:t>│   │   │   │   └── ThemeSwitcher.tsx</w:t>
+        <w:br/>
+        <w:t>│   │   │   ├── hooks</w:t>
+        <w:br/>
+        <w:t>│   │   │   │   ├── use-socket.ts</w:t>
+        <w:br/>
+        <w:t>│   │   │   │   ├── useAuth.ts</w:t>
+        <w:br/>
+        <w:t>│   │   │   │   ├── useEmails.ts</w:t>
+        <w:br/>
+        <w:t>│   │   │   │   ├── useEventData.ts</w:t>
+        <w:br/>
+        <w:t>│   │   │   │   ├── useEvents.ts</w:t>
+        <w:br/>
+        <w:t>│   │   │   │   ├── useFiles.ts</w:t>
+        <w:br/>
+        <w:t>│   │   │   │   ├── usePermissions.ts</w:t>
+        <w:br/>
+        <w:t>│   │   │   │   ├── usePosters.ts</w:t>
+        <w:br/>
+        <w:t>│   │   │   │   ├── useRooms.ts</w:t>
+        <w:br/>
+        <w:t>│   │   │   │   ├── useSessions.ts</w:t>
+        <w:br/>
+        <w:t>│   │   │   │   ├── useSpeakers.ts</w:t>
+        <w:br/>
+        <w:t>│   │   │   │   ├── useTheme.ts</w:t>
+        <w:br/>
+        <w:t>│   │   │   │   ├── useToast.ts</w:t>
+        <w:br/>
+        <w:t>│   │   │   │   └── useWebSocket.ts</w:t>
+        <w:br/>
+        <w:t>│   │   │   ├── lib</w:t>
+        <w:br/>
+        <w:t>│   │   │   │   ├── api-client.ts</w:t>
+        <w:br/>
+        <w:t>│   │   │   │   ├── auth.ts</w:t>
+        <w:br/>
+        <w:t>│   │   │   │   ├── constants.ts</w:t>
+        <w:br/>
+        <w:t>│   │   │   │   ├── permissions.ts</w:t>
+        <w:br/>
+        <w:t>│   │   │   │   ├── socket.ts</w:t>
+        <w:br/>
+        <w:t>│   │   │   │   └── utils.ts</w:t>
+        <w:br/>
+        <w:t>│   │   │   ├── organizer-portal</w:t>
+        <w:br/>
+        <w:t>│   │   │   ├── public</w:t>
+        <w:br/>
+        <w:t>│   │   │   │   └── samples</w:t>
+        <w:br/>
+        <w:t>│   │   │   │       └── sample_agenda.xlsx</w:t>
+        <w:br/>
+        <w:t>│   │   │   ├── services</w:t>
+        <w:br/>
+        <w:t>│   │   │   │   ├── auth-service.ts</w:t>
+        <w:br/>
+        <w:t>│   │   │   │   ├── email-service.ts</w:t>
+        <w:br/>
+        <w:t>│   │   │   │   └── event-service.ts</w:t>
+        <w:br/>
+        <w:t>│   │   │   ├── src</w:t>
+        <w:br/>
+        <w:t>│   │   │   │   └── styles</w:t>
+        <w:br/>
+        <w:t>│   │   │   │       ├── global.css</w:t>
+        <w:br/>
+        <w:t>│   │   │   │       └── themes.css</w:t>
+        <w:br/>
+        <w:t>│   │   │   ├── store</w:t>
+        <w:br/>
+        <w:t>│   │   │   │   ├── use-auth-store.ts</w:t>
+        <w:br/>
+        <w:t>│   │   │   │   ├── useEventStore.ts</w:t>
+        <w:br/>
+        <w:t>│   │   │   │   ├── useFloatingToolbarStore.ts</w:t>
+        <w:br/>
+        <w:t>│   │   │   │   ├── useModalStore.ts</w:t>
+        <w:br/>
+        <w:t>│   │   │   │   ├── useNotificationStore.ts</w:t>
+        <w:br/>
+        <w:t>│   │   │   │   └── useUIStore.ts</w:t>
+        <w:br/>
+        <w:t>│   │   │   ├── types</w:t>
+        <w:br/>
+        <w:t>│   │   │   │   ├── api.ts</w:t>
+        <w:br/>
+        <w:t>│   │   │   │   ├── backend.ts</w:t>
+        <w:br/>
+        <w:t>│   │   │   │   └── models.ts</w:t>
+        <w:br/>
+        <w:t>│   │   │   ├── .env.example</w:t>
+        <w:br/>
+        <w:t>│   │   │   ├── next-env.d.ts</w:t>
+        <w:br/>
+        <w:t>│   │   │   ├── next.config.mjs</w:t>
+        <w:br/>
+        <w:t>│   │   │   ├── package.json</w:t>
+        <w:br/>
+        <w:t>│   │   │   ├── postcss.config.mjs</w:t>
+        <w:br/>
+        <w:t>│   │   │   ├── tailwind.config.ts</w:t>
+        <w:br/>
+        <w:t>│   │   │   ├── tsconfig.json</w:t>
+        <w:br/>
+        <w:t>│   │   │   └── tsconfig.tsbuildinfo</w:t>
+        <w:br/>
+        <w:t>│   │   ├── registration-portal</w:t>
+        <w:br/>
+        <w:t>│   │   └── speaker-portal</w:t>
+        <w:br/>
+        <w:t>│   └── venue</w:t>
+        <w:br/>
+        <w:t>│       ├── room-presentation</w:t>
+        <w:br/>
+        <w:t>│       └── technician-dashboard</w:t>
+        <w:br/>
         <w:t>├── backend</w:t>
         <w:br/>
         <w:t>│   ├── alembic</w:t>
@@ -340,8 +832,6 @@
         <w:br/>
         <w:t>│   │   │   └── webhook.py</w:t>
         <w:br/>
-        <w:t>│   │   ├── scratch</w:t>
-        <w:br/>
         <w:t>│   │   ├── services</w:t>
         <w:br/>
         <w:t>│   │   │   ├── __init__.py</w:t>
@@ -422,104 +912,6 @@
         <w:br/>
         <w:t>│   │   └── worker.py</w:t>
         <w:br/>
-        <w:t>│   ├── data</w:t>
-        <w:br/>
-        <w:t>│   │   └── storage</w:t>
-        <w:br/>
-        <w:t>│   │       ├── assets</w:t>
-        <w:br/>
-        <w:t>│   │       │   └── signatures</w:t>
-        <w:br/>
-        <w:t>│   │       │       └── fb611bfb-c92a-4ec6-b906-1ae14ceb9b6c</w:t>
-        <w:br/>
-        <w:t>│   │       │           ├── avatar</w:t>
-        <w:br/>
-        <w:t>│   │       │           │   └── 8606e46e-fa93-4cf3-b910-73b5ac249737.png</w:t>
-        <w:br/>
-        <w:t>│   │       │           └── logo</w:t>
-        <w:br/>
-        <w:t>│   │       │               ├── 850d52ed-e415-4922-ade2-d35019f5079b.png</w:t>
-        <w:br/>
-        <w:t>│   │       │               ├── 9b17ae15-f50d-4d61-bf18-fe10e2dd541c.png</w:t>
-        <w:br/>
-        <w:t>│   │       │               └── a9cfb35c-5419-4188-af83-8e3fc39be6e5.png</w:t>
-        <w:br/>
-        <w:t>│   │       ├── imports</w:t>
-        <w:br/>
-        <w:t>│   │       │   └── imports</w:t>
-        <w:br/>
-        <w:t>│   │       │       └── fb611bfb-c92a-4ec6-b906-1ae14ceb9b6c</w:t>
-        <w:br/>
-        <w:t>│   │       │           ├── 1fd0896d-00c7-4de5-872e-3927aa369707.xlsx</w:t>
-        <w:br/>
-        <w:t>│   │       │           ├── 40f00231-34d3-4eb4-9906-8971e379a63b.xlsx</w:t>
-        <w:br/>
-        <w:t>│   │       │           └── 64355614-5789-4d5b-a45d-623dab5a885d.xlsx</w:t>
-        <w:br/>
-        <w:t>│   │       ├── presentations</w:t>
-        <w:br/>
-        <w:t>│   │       │   └── presentations</w:t>
-        <w:br/>
-        <w:t>│   │       │       └── AI-SUMMIT-2026</w:t>
-        <w:br/>
-        <w:t>│   │       │           ├── Hall-B</w:t>
-        <w:br/>
-        <w:t>│   │       │           │   └── 2026-10-03</w:t>
-        <w:br/>
-        <w:t>│   │       │           │       └── AI-Summit-Session-42</w:t>
-        <w:br/>
-        <w:t>│   │       │           │           └── Aarav-Gupta</w:t>
-        <w:br/>
-        <w:t>│   │       │           │               └── SCQ-00915-signed.pdf</w:t>
-        <w:br/>
-        <w:t>│   │       │           ├── Hall-D</w:t>
-        <w:br/>
-        <w:t>│   │       │           │   └── 2026-10-02</w:t>
-        <w:br/>
-        <w:t>│   │       │           │       └── AI-Summit-Session-28</w:t>
-        <w:br/>
-        <w:t>│   │       │           │           └── Aarav-Gupta</w:t>
-        <w:br/>
-        <w:t>│   │       │           │               ├── Aarav_Gupta_assets.zip</w:t>
-        <w:br/>
-        <w:t>│   │       │           │               ├── InterviewQandAonLogfieldsfromvarioussecuritydevicesforLoganalysis_v02.pptx</w:t>
-        <w:br/>
-        <w:t>│   │       │           │               └── SCQ-00915-signed_v01.pdf</w:t>
-        <w:br/>
-        <w:t>│   │       │           ├── Hall-E</w:t>
-        <w:br/>
-        <w:t>│   │       │           │   └── 2026-10-03</w:t>
-        <w:br/>
-        <w:t>│   │       │           │       └── AI-Summit-Session-49</w:t>
-        <w:br/>
-        <w:t>│   │       │           │           └── Aarav-Gupta</w:t>
-        <w:br/>
-        <w:t>│   │       │           │               ├── 6ec277f4-7480-4cc9-a5b9-80bc2ef13264.pdf</w:t>
-        <w:br/>
-        <w:t>│   │       │           │               └── analytics_v01.pdf</w:t>
-        <w:br/>
-        <w:t>│   │       │           └── Hall-F</w:t>
-        <w:br/>
-        <w:t>│   │       │               └── 2026-10-02</w:t>
-        <w:br/>
-        <w:t>│   │       │                   └── AI-Summit-Session-35</w:t>
-        <w:br/>
-        <w:t>│   │       │                       └── Aarav-Gupta</w:t>
-        <w:br/>
-        <w:t>│   │       │                           ├── InterviewQandAonLogfieldsfromvarioussecuritydevicesforLoganalysis.pptx</w:t>
-        <w:br/>
-        <w:t>│   │       │                           └── InterviewQandAonLogfieldsfromvarioussecuritydevicesforLoganalysis_v01.pptx</w:t>
-        <w:br/>
-        <w:t>│   │       ├── registration_uploads</w:t>
-        <w:br/>
-        <w:t>│   │       │   └── fb611bfb-c92a-4ec6-b906-1ae14ceb9b6c</w:t>
-        <w:br/>
-        <w:t>│   │       │       └── f06f695d-98e8-4cb9-b56d-e2c2a5150a1b.png</w:t>
-        <w:br/>
-        <w:t>│   │       └── thumbnails</w:t>
-        <w:br/>
-        <w:t>│   │           └── thumbnails</w:t>
-        <w:br/>
         <w:t>│   ├── scratch</w:t>
         <w:br/>
         <w:t>│   │   ├── check_db_constraints.py</w:t>
@@ -714,6 +1106,10 @@
         <w:br/>
         <w:t>│   │   │   │   │   ├── [eventId]</w:t>
         <w:br/>
+        <w:t>│   │   │   │   │   │   ├── dashboard</w:t>
+        <w:br/>
+        <w:t>│   │   │   │   │   │   │   └── page.tsx</w:t>
+        <w:br/>
         <w:t>│   │   │   │   │   │   ├── registration</w:t>
         <w:br/>
         <w:t>│   │   │   │   │   │   │   ├── capacity</w:t>
@@ -832,8 +1228,6 @@
         <w:br/>
         <w:t>│   │   │   │   └── layout.tsx</w:t>
         <w:br/>
-        <w:t>│   │   │   ├── test-route</w:t>
-        <w:br/>
         <w:t>│   │   │   ├── globals.css</w:t>
         <w:br/>
         <w:t>│   │   │   ├── layout.tsx</w:t>
@@ -992,8 +1386,6 @@
         <w:br/>
         <w:t>│   │   │   │   └── TimelineView.tsx</w:t>
         <w:br/>
-        <w:t>│   │   │   ├── settings</w:t>
-        <w:br/>
         <w:t>│   │   │   ├── speakers</w:t>
         <w:br/>
         <w:t>│   │   │   │   ├── EmailCampaignDialog.tsx</w:t>
@@ -1328,6 +1720,110 @@
         <w:br/>
         <w:t>│   └── seed_demo_event.py</w:t>
         <w:br/>
+        <w:t>├── storage</w:t>
+        <w:br/>
+        <w:t>│   └── storage</w:t>
+        <w:br/>
+        <w:t>│       ├── assets</w:t>
+        <w:br/>
+        <w:t>│       │   └── signatures</w:t>
+        <w:br/>
+        <w:t>│       │       └── fb611bfb-c92a-4ec6-b906-1ae14ceb9b6c</w:t>
+        <w:br/>
+        <w:t>│       │           ├── avatar</w:t>
+        <w:br/>
+        <w:t>│       │           │   └── 8606e46e-fa93-4cf3-b910-73b5ac249737.png</w:t>
+        <w:br/>
+        <w:t>│       │           └── logo</w:t>
+        <w:br/>
+        <w:t>│       │               ├── 850d52ed-e415-4922-ade2-d35019f5079b.png</w:t>
+        <w:br/>
+        <w:t>│       │               ├── 9b17ae15-f50d-4d61-bf18-fe10e2dd541c.png</w:t>
+        <w:br/>
+        <w:t>│       │               └── a9cfb35c-5419-4188-af83-8e3fc39be6e5.png</w:t>
+        <w:br/>
+        <w:t>│       ├── imports</w:t>
+        <w:br/>
+        <w:t>│       │   └── imports</w:t>
+        <w:br/>
+        <w:t>│       │       └── fb611bfb-c92a-4ec6-b906-1ae14ceb9b6c</w:t>
+        <w:br/>
+        <w:t>│       │           ├── 1fd0896d-00c7-4de5-872e-3927aa369707.xlsx</w:t>
+        <w:br/>
+        <w:t>│       │           ├── 40f00231-34d3-4eb4-9906-8971e379a63b.xlsx</w:t>
+        <w:br/>
+        <w:t>│       │           └── 64355614-5789-4d5b-a45d-623dab5a885d.xlsx</w:t>
+        <w:br/>
+        <w:t>│       ├── presentations</w:t>
+        <w:br/>
+        <w:t>│       │   └── presentations</w:t>
+        <w:br/>
+        <w:t>│       │       └── AI-SUMMIT-2026</w:t>
+        <w:br/>
+        <w:t>│       │           ├── Hall-B</w:t>
+        <w:br/>
+        <w:t>│       │           │   └── 2026-10-03</w:t>
+        <w:br/>
+        <w:t>│       │           │       └── AI-Summit-Session-42</w:t>
+        <w:br/>
+        <w:t>│       │           │           └── Aarav-Gupta</w:t>
+        <w:br/>
+        <w:t>│       │           │               └── SCQ-00915-signed.pdf</w:t>
+        <w:br/>
+        <w:t>│       │           ├── Hall-D</w:t>
+        <w:br/>
+        <w:t>│       │           │   └── 2026-10-02</w:t>
+        <w:br/>
+        <w:t>│       │           │       └── AI-Summit-Session-28</w:t>
+        <w:br/>
+        <w:t>│       │           │           └── Aarav-Gupta</w:t>
+        <w:br/>
+        <w:t>│       │           │               ├── Aarav_Gupta_assets.zip</w:t>
+        <w:br/>
+        <w:t>│       │           │               ├── InterviewQandAonLogfieldsfromvarioussecuritydevicesforLoganalysis_v02.pptx</w:t>
+        <w:br/>
+        <w:t>│       │           │               └── SCQ-00915-signed_v01.pdf</w:t>
+        <w:br/>
+        <w:t>│       │           ├── Hall-E</w:t>
+        <w:br/>
+        <w:t>│       │           │   └── 2026-10-03</w:t>
+        <w:br/>
+        <w:t>│       │           │       └── AI-Summit-Session-49</w:t>
+        <w:br/>
+        <w:t>│       │           │           └── Aarav-Gupta</w:t>
+        <w:br/>
+        <w:t>│       │           │               ├── 6ec277f4-7480-4cc9-a5b9-80bc2ef13264.pdf</w:t>
+        <w:br/>
+        <w:t>│       │           │               └── analytics_v01.pdf</w:t>
+        <w:br/>
+        <w:t>│       │           └── Hall-F</w:t>
+        <w:br/>
+        <w:t>│       │               └── 2026-10-02</w:t>
+        <w:br/>
+        <w:t>│       │                   └── AI-Summit-Session-35</w:t>
+        <w:br/>
+        <w:t>│       │                       └── Aarav-Gupta</w:t>
+        <w:br/>
+        <w:t>│       │                           ├── InterviewQandAonLogfieldsfromvarioussecuritydevicesforLoganalysis.pptx</w:t>
+        <w:br/>
+        <w:t>│       │                           └── InterviewQandAonLogfieldsfromvarioussecuritydevicesforLoganalysis_v01.pptx</w:t>
+        <w:br/>
+        <w:t>│       └── registration_uploads</w:t>
+        <w:br/>
+        <w:t>│           └── fb611bfb-c92a-4ec6-b906-1ae14ceb9b6c</w:t>
+        <w:br/>
+        <w:t>│               └── f06f695d-98e8-4cb9-b56d-e2c2a5150a1b.png</w:t>
+        <w:br/>
+        <w:t>├── tools</w:t>
+        <w:br/>
+        <w:t>│   ├── logs</w:t>
+        <w:br/>
+        <w:t>│   │   └── project_structure.docx</w:t>
+        <w:br/>
+        <w:t>│   └── project_refactor</w:t>
+        <w:br/>
+        <w:t>│       └── refactor_project.py</w:t>
+        <w:br/>
         <w:t>├── venue</w:t>
         <w:br/>
         <w:t>│   ├── eposter-display</w:t>
@@ -1792,7 +2288,13 @@
         <w:br/>
         <w:t>├── docker-compose.yml</w:t>
         <w:br/>
+        <w:t>├── migration_report.json</w:t>
+        <w:br/>
         <w:t>├── package.json</w:t>
+        <w:br/>
+        <w:t>├── project_structure.docx</w:t>
+        <w:br/>
+        <w:t>├── project_structure.pdf</w:t>
         <w:br/>
         <w:t>└── README.md</w:t>
       </w:r>

</xml_diff>

<commit_message>
feat: implement comprehensive platform expansion including command center dashboards, organiser portal modules, theme engine, and marketplace infrastructure.
</commit_message>
<xml_diff>
--- a/project_structure.docx
+++ b/project_structure.docx
@@ -40,343 +40,367 @@
         <w:br/>
         <w:t>│   │   │   │   ├── (dashboard)</w:t>
         <w:br/>
-        <w:t>│   │   │   │   │   ├── ai-control</w:t>
+        <w:t>│   │   │   │   │   ├── ai-workspace</w:t>
+        <w:br/>
+        <w:t>│   │   │   │   │   │   ├── agents</w:t>
+        <w:br/>
+        <w:t>│   │   │   │   │   │   │   └── page.tsx</w:t>
+        <w:br/>
+        <w:t>│   │   │   │   │   │   ├── automation</w:t>
+        <w:br/>
+        <w:t>│   │   │   │   │   │   │   └── page.tsx</w:t>
+        <w:br/>
+        <w:t>│   │   │   │   │   │   ├── dashboard</w:t>
+        <w:br/>
+        <w:t>│   │   │   │   │   │   │   └── page.tsx</w:t>
+        <w:br/>
+        <w:t>│   │   │   │   │   │   ├── models</w:t>
+        <w:br/>
+        <w:t>│   │   │   │   │   │   │   └── page.tsx</w:t>
+        <w:br/>
+        <w:t>│   │   │   │   │   │   └── prompt-library</w:t>
+        <w:br/>
+        <w:t>│   │   │   │   │   │       └── page.tsx</w:t>
+        <w:br/>
+        <w:t>│   │   │   │   │   ├── applications</w:t>
+        <w:br/>
+        <w:t>│   │   │   │   │   │   ├── feature-flags</w:t>
+        <w:br/>
+        <w:t>│   │   │   │   │   │   │   └── page.tsx</w:t>
+        <w:br/>
+        <w:t>│   │   │   │   │   │   └── registry</w:t>
+        <w:br/>
+        <w:t>│   │   │   │   │   │       └── page.tsx</w:t>
+        <w:br/>
+        <w:t>│   │   │   │   │   ├── business</w:t>
+        <w:br/>
+        <w:t>│   │   │   │   │   │   ├── dashboard</w:t>
+        <w:br/>
+        <w:t>│   │   │   │   │   │   │   └── page.tsx</w:t>
+        <w:br/>
+        <w:t>│   │   │   │   │   │   ├── pricing</w:t>
+        <w:br/>
+        <w:t>│   │   │   │   │   │   │   ├── hardware-catalog</w:t>
+        <w:br/>
+        <w:t>│   │   │   │   │   │   │   │   └── page.tsx</w:t>
+        <w:br/>
+        <w:t>│   │   │   │   │   │   │   ├── margin-rules</w:t>
+        <w:br/>
+        <w:t>│   │   │   │   │   │   │   │   └── page.tsx</w:t>
+        <w:br/>
+        <w:t>│   │   │   │   │   │   │   ├── price-history</w:t>
+        <w:br/>
+        <w:t>│   │   │   │   │   │   │   │   └── page.tsx</w:t>
+        <w:br/>
+        <w:t>│   │   │   │   │   │   │   ├── pricing-simulator</w:t>
+        <w:br/>
+        <w:t>│   │   │   │   │   │   │   │   └── page.tsx</w:t>
+        <w:br/>
+        <w:t>│   │   │   │   │   │   │   ├── saved-simulations</w:t>
+        <w:br/>
+        <w:t>│   │   │   │   │   │   │   │   └── page.tsx</w:t>
+        <w:br/>
+        <w:t>│   │   │   │   │   │   │   ├── staff-catalog</w:t>
+        <w:br/>
+        <w:t>│   │   │   │   │   │   │   │   └── page.tsx</w:t>
+        <w:br/>
+        <w:t>│   │   │   │   │   │   │   ├── templates</w:t>
+        <w:br/>
+        <w:t>│   │   │   │   │   │   │   │   ├── network</w:t>
+        <w:br/>
+        <w:t>│   │   │   │   │   │   │   │   │   └── page.tsx</w:t>
+        <w:br/>
+        <w:t>│   │   │   │   │   │   │   │   ├── registration</w:t>
+        <w:br/>
+        <w:t>│   │   │   │   │   │   │   │   │   └── page.tsx</w:t>
+        <w:br/>
+        <w:t>│   │   │   │   │   │   │   │   ├── room</w:t>
+        <w:br/>
+        <w:t>│   │   │   │   │   │   │   │   │   └── page.tsx</w:t>
+        <w:br/>
+        <w:t>│   │   │   │   │   │   │   │   ├── srr</w:t>
+        <w:br/>
+        <w:t>│   │   │   │   │   │   │   │   │   └── page.tsx</w:t>
+        <w:br/>
+        <w:t>│   │   │   │   │   │   │   │   └── page.tsx</w:t>
+        <w:br/>
+        <w:t>│   │   │   │   │   │   │   └── vendor-pricing</w:t>
+        <w:br/>
+        <w:t>│   │   │   │   │   │   │       └── page.tsx</w:t>
+        <w:br/>
+        <w:t>│   │   │   │   │   │   ├── revenue</w:t>
+        <w:br/>
+        <w:t>│   │   │   │   │   │   │   └── page.tsx</w:t>
+        <w:br/>
+        <w:t>│   │   │   │   │   │   ├── sales</w:t>
+        <w:br/>
+        <w:t>│   │   │   │   │   │   │   ├── proposal-generator</w:t>
+        <w:br/>
+        <w:t>│   │   │   │   │   │   │   │   └── page.tsx</w:t>
+        <w:br/>
+        <w:t>│   │   │   │   │   │   │   ├── proposals</w:t>
+        <w:br/>
+        <w:t>│   │   │   │   │   │   │   │   ├── [id]</w:t>
+        <w:br/>
+        <w:t>│   │   │   │   │   │   │   │   │   ├── documents</w:t>
+        <w:br/>
+        <w:t>│   │   │   │   │   │   │   │   │   │   └── page.tsx</w:t>
+        <w:br/>
+        <w:t>│   │   │   │   │   │   │   │   │   ├── edit</w:t>
+        <w:br/>
+        <w:t>│   │   │   │   │   │   │   │   │   │   └── page.tsx</w:t>
+        <w:br/>
+        <w:t>│   │   │   │   │   │   │   │   │   ├── preview</w:t>
+        <w:br/>
+        <w:t>│   │   │   │   │   │   │   │   │   │   └── page.tsx</w:t>
+        <w:br/>
+        <w:t>│   │   │   │   │   │   │   │   │   └── version-history</w:t>
+        <w:br/>
+        <w:t>│   │   │   │   │   │   │   │   │       └── page.tsx</w:t>
+        <w:br/>
+        <w:t>│   │   │   │   │   │   │   │   └── create</w:t>
+        <w:br/>
+        <w:t>│   │   │   │   │   │   │   │       └── page.tsx</w:t>
+        <w:br/>
+        <w:t>│   │   │   │   │   │   │   ├── quotes</w:t>
+        <w:br/>
+        <w:t>│   │   │   │   │   │   │   │   ├── [id]</w:t>
+        <w:br/>
+        <w:t>│   │   │   │   │   │   │   │   │   ├── approval</w:t>
+        <w:br/>
+        <w:t>│   │   │   │   │   │   │   │   │   │   └── page.tsx</w:t>
+        <w:br/>
+        <w:t>│   │   │   │   │   │   │   │   │   ├── cost-breakdown</w:t>
+        <w:br/>
+        <w:t>│   │   │   │   │   │   │   │   │   │   └── page.tsx</w:t>
+        <w:br/>
+        <w:t>│   │   │   │   │   │   │   │   │   ├── edit</w:t>
+        <w:br/>
+        <w:t>│   │   │   │   │   │   │   │   │   │   └── page.tsx</w:t>
+        <w:br/>
+        <w:t>│   │   │   │   │   │   │   │   │   └── revisions</w:t>
+        <w:br/>
+        <w:t>│   │   │   │   │   │   │   │   │       └── page.tsx</w:t>
+        <w:br/>
+        <w:t>│   │   │   │   │   │   │   │   └── create</w:t>
+        <w:br/>
+        <w:t>│   │   │   │   │   │   │   │       └── page.tsx</w:t>
+        <w:br/>
+        <w:t>│   │   │   │   │   │   │   └── service-requests</w:t>
+        <w:br/>
+        <w:t>│   │   │   │   │   │   │       ├── [id]</w:t>
+        <w:br/>
+        <w:t>│   │   │   │   │   │   │       │   ├── requirements</w:t>
+        <w:br/>
+        <w:t>│   │   │   │   │   │   │       │   │   └── page.tsx</w:t>
+        <w:br/>
+        <w:t>│   │   │   │   │   │   │       │   ├── resource-planning</w:t>
+        <w:br/>
+        <w:t>│   │   │   │   │   │   │       │   │   └── page.tsx</w:t>
+        <w:br/>
+        <w:t>│   │   │   │   │   │   │       │   └── page.tsx</w:t>
+        <w:br/>
+        <w:t>│   │   │   │   │   │   │       └── page.tsx</w:t>
+        <w:br/>
+        <w:t>│   │   │   │   │   │   └── subscription</w:t>
+        <w:br/>
+        <w:t>│   │   │   │   │   │       ├── add-ons</w:t>
+        <w:br/>
+        <w:t>│   │   │   │   │   │       │   └── page.tsx</w:t>
+        <w:br/>
+        <w:t>│   │   │   │   │   │       └── plans</w:t>
+        <w:br/>
+        <w:t>│   │   │   │   │   │           └── page.tsx</w:t>
+        <w:br/>
+        <w:t>│   │   │   │   │   ├── dashboard</w:t>
+        <w:br/>
+        <w:t>│   │   │   │   │   │   ├── live-activity</w:t>
+        <w:br/>
+        <w:t>│   │   │   │   │   │   │   └── page.tsx</w:t>
+        <w:br/>
+        <w:t>│   │   │   │   │   │   ├── overview</w:t>
+        <w:br/>
+        <w:t>│   │   │   │   │   │   │   └── page.tsx</w:t>
+        <w:br/>
+        <w:t>│   │   │   │   │   │   └── platform-health</w:t>
+        <w:br/>
+        <w:t>│   │   │   │   │   │       └── page.tsx</w:t>
+        <w:br/>
+        <w:t>│   │   │   │   │   ├── developer-platform</w:t>
+        <w:br/>
+        <w:t>│   │   │   │   │   │   ├── api-keys</w:t>
+        <w:br/>
+        <w:t>│   │   │   │   │   │   │   └── page.tsx</w:t>
+        <w:br/>
+        <w:t>│   │   │   │   │   │   ├── apis</w:t>
+        <w:br/>
+        <w:t>│   │   │   │   │   │   │   └── page.tsx</w:t>
+        <w:br/>
+        <w:t>│   │   │   │   │   │   ├── integrations</w:t>
+        <w:br/>
+        <w:t>│   │   │   │   │   │   │   └── page.tsx</w:t>
+        <w:br/>
+        <w:t>│   │   │   │   │   │   ├── logs</w:t>
+        <w:br/>
+        <w:t>│   │   │   │   │   │   │   └── page.tsx</w:t>
+        <w:br/>
+        <w:t>│   │   │   │   │   │   └── webhooks</w:t>
+        <w:br/>
+        <w:t>│   │   │   │   │   │       └── page.tsx</w:t>
+        <w:br/>
+        <w:t>│   │   │   │   │   ├── finance</w:t>
+        <w:br/>
+        <w:t>│   │   │   │   │   │   ├── invoices</w:t>
+        <w:br/>
+        <w:t>│   │   │   │   │   │   │   └── page.tsx</w:t>
+        <w:br/>
+        <w:t>│   │   │   │   │   │   ├── payments</w:t>
+        <w:br/>
+        <w:t>│   │   │   │   │   │   │   └── page.tsx</w:t>
+        <w:br/>
+        <w:t>│   │   │   │   │   │   ├── taxes</w:t>
+        <w:br/>
+        <w:t>│   │   │   │   │   │   │   └── page.tsx</w:t>
+        <w:br/>
+        <w:t>│   │   │   │   │   │   └── transactions</w:t>
+        <w:br/>
+        <w:t>│   │   │   │   │   │       └── page.tsx</w:t>
+        <w:br/>
+        <w:t>│   │   │   │   │   ├── identity-security</w:t>
+        <w:br/>
+        <w:t>│   │   │   │   │   │   ├── audit-logs</w:t>
+        <w:br/>
+        <w:t>│   │   │   │   │   │   │   └── page.tsx</w:t>
+        <w:br/>
+        <w:t>│   │   │   │   │   │   ├── impersonation</w:t>
+        <w:br/>
+        <w:t>│   │   │   │   │   │   │   └── page.tsx</w:t>
+        <w:br/>
+        <w:t>│   │   │   │   │   │   ├── permissions</w:t>
+        <w:br/>
+        <w:t>│   │   │   │   │   │   │   └── page.tsx</w:t>
+        <w:br/>
+        <w:t>│   │   │   │   │   │   ├── roles</w:t>
+        <w:br/>
+        <w:t>│   │   │   │   │   │   │   └── page.tsx</w:t>
+        <w:br/>
+        <w:t>│   │   │   │   │   │   ├── security-events</w:t>
+        <w:br/>
+        <w:t>│   │   │   │   │   │   │   └── page.tsx</w:t>
+        <w:br/>
+        <w:t>│   │   │   │   │   │   └── users</w:t>
+        <w:br/>
+        <w:t>│   │   │   │   │   │       └── page.tsx</w:t>
+        <w:br/>
+        <w:t>│   │   │   │   │   ├── operations-center</w:t>
         <w:br/>
         <w:t>│   │   │   │   │   │   ├── analytics</w:t>
         <w:br/>
         <w:t>│   │   │   │   │   │   │   └── page.tsx</w:t>
         <w:br/>
-        <w:t>│   │   │   │   │   │   ├── dashboard</w:t>
+        <w:t>│   │   │   │   │   │   ├── database</w:t>
         <w:br/>
         <w:t>│   │   │   │   │   │   │   └── page.tsx</w:t>
         <w:br/>
-        <w:t>│   │   │   │   │   │   ├── limits</w:t>
+        <w:t>│   │   │   │   │   │   ├── deployments</w:t>
         <w:br/>
         <w:t>│   │   │   │   │   │   │   └── page.tsx</w:t>
         <w:br/>
-        <w:t>│   │   │   │   │   │   ├── models</w:t>
+        <w:t>│   │   │   │   │   │   ├── jobs</w:t>
         <w:br/>
         <w:t>│   │   │   │   │   │   │   └── page.tsx</w:t>
         <w:br/>
-        <w:t>│   │   │   │   │   │   └── prompts</w:t>
+        <w:t>│   │   │   │   │   │   ├── projects</w:t>
+        <w:br/>
+        <w:t>│   │   │   │   │   │   │   └── page.tsx</w:t>
+        <w:br/>
+        <w:t>│   │   │   │   │   │   ├── requests</w:t>
+        <w:br/>
+        <w:t>│   │   │   │   │   │   │   └── page.tsx</w:t>
+        <w:br/>
+        <w:t>│   │   │   │   │   │   ├── resources</w:t>
+        <w:br/>
+        <w:t>│   │   │   │   │   │   │   └── page.tsx</w:t>
+        <w:br/>
+        <w:t>│   │   │   │   │   │   ├── risk-analysis</w:t>
+        <w:br/>
+        <w:t>│   │   │   │   │   │   │   └── page.tsx</w:t>
+        <w:br/>
+        <w:t>│   │   │   │   │   │   ├── search</w:t>
+        <w:br/>
+        <w:t>│   │   │   │   │   │   │   └── page.tsx</w:t>
+        <w:br/>
+        <w:t>│   │   │   │   │   │   ├── storage</w:t>
+        <w:br/>
+        <w:t>│   │   │   │   │   │   │   └── page.tsx</w:t>
+        <w:br/>
+        <w:t>│   │   │   │   │   │   ├── venue-readiness</w:t>
+        <w:br/>
+        <w:t>│   │   │   │   │   │   │   └── page.tsx</w:t>
+        <w:br/>
+        <w:t>│   │   │   │   │   │   └── page.tsx</w:t>
+        <w:br/>
+        <w:t>│   │   │   │   │   ├── organizations</w:t>
+        <w:br/>
+        <w:t>│   │   │   │   │   │   ├── [orgId]</w:t>
+        <w:br/>
+        <w:t>│   │   │   │   │   │   │   └── page.tsx</w:t>
+        <w:br/>
+        <w:t>│   │   │   │   │   │   └── page.tsx</w:t>
+        <w:br/>
+        <w:t>│   │   │   │   │   ├── platform-settings</w:t>
+        <w:br/>
+        <w:t>│   │   │   │   │   │   ├── authentication</w:t>
+        <w:br/>
+        <w:t>│   │   │   │   │   │   │   └── page.tsx</w:t>
+        <w:br/>
+        <w:t>│   │   │   │   │   │   ├── branding</w:t>
+        <w:br/>
+        <w:t>│   │   │   │   │   │   │   └── page.tsx</w:t>
+        <w:br/>
+        <w:t>│   │   │   │   │   │   ├── general</w:t>
+        <w:br/>
+        <w:t>│   │   │   │   │   │   │   └── page.tsx</w:t>
+        <w:br/>
+        <w:t>│   │   │   │   │   │   ├── localization</w:t>
+        <w:br/>
+        <w:t>│   │   │   │   │   │   │   └── page.tsx</w:t>
+        <w:br/>
+        <w:t>│   │   │   │   │   │   └── notifications</w:t>
         <w:br/>
         <w:t>│   │   │   │   │   │       └── page.tsx</w:t>
         <w:br/>
-        <w:t>│   │   │   │   │   ├── applications</w:t>
-        <w:br/>
-        <w:t>│   │   │   │   │   │   ├── feature-flags</w:t>
+        <w:t>│   │   │   │   │   ├── reports</w:t>
+        <w:br/>
+        <w:t>│   │   │   │   │   │   ├── analytics</w:t>
         <w:br/>
         <w:t>│   │   │   │   │   │   │   └── page.tsx</w:t>
         <w:br/>
-        <w:t>│   │   │   │   │   │   └── registry</w:t>
+        <w:t>│   │   │   │   │   │   └── exports</w:t>
         <w:br/>
         <w:t>│   │   │   │   │   │       └── page.tsx</w:t>
         <w:br/>
-        <w:t>│   │   │   │   │   ├── catalogs</w:t>
-        <w:br/>
-        <w:t>│   │   │   │   │   │   ├── hardware</w:t>
+        <w:t>│   │   │   │   │   ├── support-center</w:t>
+        <w:br/>
+        <w:t>│   │   │   │   │   │   ├── announcements</w:t>
+        <w:br/>
+        <w:t>│   │   │   │   │   │   │   ├── [ticketId]</w:t>
+        <w:br/>
+        <w:t>│   │   │   │   │   │   │   │   └── page.tsx</w:t>
         <w:br/>
         <w:t>│   │   │   │   │   │   │   └── page.tsx</w:t>
         <w:br/>
-        <w:t>│   │   │   │   │   │   └── staff</w:t>
+        <w:t>│   │   │   │   │   │   ├── knowledge-base</w:t>
+        <w:br/>
+        <w:t>│   │   │   │   │   │   │   └── page.tsx</w:t>
+        <w:br/>
+        <w:t>│   │   │   │   │   │   └── tickets</w:t>
+        <w:br/>
+        <w:t>│   │   │   │   │   │       ├── [ticketId]</w:t>
+        <w:br/>
+        <w:t>│   │   │   │   │   │       │   └── page.tsx</w:t>
         <w:br/>
         <w:t>│   │   │   │   │   │       └── page.tsx</w:t>
-        <w:br/>
-        <w:t>│   │   │   │   │   ├── commercial</w:t>
-        <w:br/>
-        <w:t>│   │   │   │   │   │   ├── dashboard</w:t>
-        <w:br/>
-        <w:t>│   │   │   │   │   │   │   └── page.tsx</w:t>
-        <w:br/>
-        <w:t>│   │   │   │   │   │   ├── invoices</w:t>
-        <w:br/>
-        <w:t>│   │   │   │   │   │   │   └── page.tsx</w:t>
-        <w:br/>
-        <w:t>│   │   │   │   │   │   ├── margin-rules</w:t>
-        <w:br/>
-        <w:t>│   │   │   │   │   │   │   └── page.tsx</w:t>
-        <w:br/>
-        <w:t>│   │   │   │   │   │   ├── plans</w:t>
-        <w:br/>
-        <w:t>│   │   │   │   │   │   │   └── page.tsx</w:t>
-        <w:br/>
-        <w:t>│   │   │   │   │   │   ├── price-history</w:t>
-        <w:br/>
-        <w:t>│   │   │   │   │   │   │   └── page.tsx</w:t>
-        <w:br/>
-        <w:t>│   │   │   │   │   │   ├── pricing-simulator</w:t>
-        <w:br/>
-        <w:t>│   │   │   │   │   │   │   └── page.tsx</w:t>
-        <w:br/>
-        <w:t>│   │   │   │   │   │   ├── proposal-generator</w:t>
-        <w:br/>
-        <w:t>│   │   │   │   │   │   │   └── page.tsx</w:t>
-        <w:br/>
-        <w:t>│   │   │   │   │   │   ├── revenue</w:t>
-        <w:br/>
-        <w:t>│   │   │   │   │   │   │   └── page.tsx</w:t>
-        <w:br/>
-        <w:t>│   │   │   │   │   │   ├── saved-simulations</w:t>
-        <w:br/>
-        <w:t>│   │   │   │   │   │   │   └── page.tsx</w:t>
-        <w:br/>
-        <w:t>│   │   │   │   │   │   ├── subscriptions</w:t>
-        <w:br/>
-        <w:t>│   │   │   │   │   │   │   └── page.tsx</w:t>
-        <w:br/>
-        <w:t>│   │   │   │   │   │   ├── templates</w:t>
-        <w:br/>
-        <w:t>│   │   │   │   │   │   │   ├── network</w:t>
-        <w:br/>
-        <w:t>│   │   │   │   │   │   │   │   └── page.tsx</w:t>
-        <w:br/>
-        <w:t>│   │   │   │   │   │   │   ├── registration</w:t>
-        <w:br/>
-        <w:t>│   │   │   │   │   │   │   │   └── page.tsx</w:t>
-        <w:br/>
-        <w:t>│   │   │   │   │   │   │   ├── room</w:t>
-        <w:br/>
-        <w:t>│   │   │   │   │   │   │   │   └── page.tsx</w:t>
-        <w:br/>
-        <w:t>│   │   │   │   │   │   │   ├── srr</w:t>
-        <w:br/>
-        <w:t>│   │   │   │   │   │   │   │   └── page.tsx</w:t>
-        <w:br/>
-        <w:t>│   │   │   │   │   │   │   └── page.tsx</w:t>
-        <w:br/>
-        <w:t>│   │   │   │   │   │   └── vendor-pricing</w:t>
-        <w:br/>
-        <w:t>│   │   │   │   │   │       └── page.tsx</w:t>
-        <w:br/>
-        <w:t>│   │   │   │   │   ├── developer</w:t>
-        <w:br/>
-        <w:t>│   │   │   │   │   │   ├── analytics</w:t>
-        <w:br/>
-        <w:t>│   │   │   │   │   │   │   └── page.tsx</w:t>
-        <w:br/>
-        <w:t>│   │   │   │   │   │   ├── integrations</w:t>
-        <w:br/>
-        <w:t>│   │   │   │   │   │   │   └── page.tsx</w:t>
-        <w:br/>
-        <w:t>│   │   │   │   │   │   ├── rate-limits</w:t>
-        <w:br/>
-        <w:t>│   │   │   │   │   │   │   └── page.tsx</w:t>
-        <w:br/>
-        <w:t>│   │   │   │   │   │   ├── webhooks</w:t>
-        <w:br/>
-        <w:t>│   │   │   │   │   │   │   └── page.tsx</w:t>
-        <w:br/>
-        <w:t>│   │   │   │   │   │   └── page.tsx</w:t>
-        <w:br/>
-        <w:t>│   │   │   │   │   ├── financial</w:t>
-        <w:br/>
-        <w:t>│   │   │   │   │   │   ├── audit-trail</w:t>
-        <w:br/>
-        <w:t>│   │   │   │   │   │   │   └── page.tsx</w:t>
-        <w:br/>
-        <w:t>│   │   │   │   │   │   ├── payment-gateways</w:t>
-        <w:br/>
-        <w:t>│   │   │   │   │   │   │   └── page.tsx</w:t>
-        <w:br/>
-        <w:t>│   │   │   │   │   │   ├── tax-config</w:t>
-        <w:br/>
-        <w:t>│   │   │   │   │   │   │   └── page.tsx</w:t>
-        <w:br/>
-        <w:t>│   │   │   │   │   │   └── transactions</w:t>
-        <w:br/>
-        <w:t>│   │   │   │   │   │       └── page.tsx</w:t>
-        <w:br/>
-        <w:t>│   │   │   │   │   ├── operations</w:t>
-        <w:br/>
-        <w:t>│   │   │   │   │   │   ├── analytics</w:t>
-        <w:br/>
-        <w:t>│   │   │   │   │   │   │   └── page.tsx</w:t>
-        <w:br/>
-        <w:t>│   │   │   │   │   │   ├── database</w:t>
-        <w:br/>
-        <w:t>│   │   │   │   │   │   │   └── page.tsx</w:t>
-        <w:br/>
-        <w:t>│   │   │   │   │   │   ├── deployments</w:t>
-        <w:br/>
-        <w:t>│   │   │   │   │   │   │   └── page.tsx</w:t>
-        <w:br/>
-        <w:t>│   │   │   │   │   │   ├── health</w:t>
-        <w:br/>
-        <w:t>│   │   │   │   │   │   │   └── page.tsx</w:t>
-        <w:br/>
-        <w:t>│   │   │   │   │   │   ├── jobs</w:t>
-        <w:br/>
-        <w:t>│   │   │   │   │   │   │   └── page.tsx</w:t>
-        <w:br/>
-        <w:t>│   │   │   │   │   │   ├── projects</w:t>
-        <w:br/>
-        <w:t>│   │   │   │   │   │   │   └── page.tsx</w:t>
-        <w:br/>
-        <w:t>│   │   │   │   │   │   ├── readiness</w:t>
-        <w:br/>
-        <w:t>│   │   │   │   │   │   │   └── page.tsx</w:t>
-        <w:br/>
-        <w:t>│   │   │   │   │   │   ├── requests</w:t>
-        <w:br/>
-        <w:t>│   │   │   │   │   │   │   └── page.tsx</w:t>
-        <w:br/>
-        <w:t>│   │   │   │   │   │   ├── resources</w:t>
-        <w:br/>
-        <w:t>│   │   │   │   │   │   │   └── page.tsx</w:t>
-        <w:br/>
-        <w:t>│   │   │   │   │   │   ├── risks</w:t>
-        <w:br/>
-        <w:t>│   │   │   │   │   │   │   └── page.tsx</w:t>
-        <w:br/>
-        <w:t>│   │   │   │   │   │   ├── search</w:t>
-        <w:br/>
-        <w:t>│   │   │   │   │   │   │   └── page.tsx</w:t>
-        <w:br/>
-        <w:t>│   │   │   │   │   │   ├── storage</w:t>
-        <w:br/>
-        <w:t>│   │   │   │   │   │   │   └── page.tsx</w:t>
-        <w:br/>
-        <w:t>│   │   │   │   │   │   └── page.tsx</w:t>
-        <w:br/>
-        <w:t>│   │   │   │   │   ├── organizations</w:t>
-        <w:br/>
-        <w:t>│   │   │   │   │   │   ├── [orgId]</w:t>
-        <w:br/>
-        <w:t>│   │   │   │   │   │   │   └── page.tsx</w:t>
-        <w:br/>
-        <w:t>│   │   │   │   │   │   └── page.tsx</w:t>
-        <w:br/>
-        <w:t>│   │   │   │   │   ├── overview</w:t>
-        <w:br/>
-        <w:t>│   │   │   │   │   │   └── page.tsx</w:t>
-        <w:br/>
-        <w:t>│   │   │   │   │   ├── proposals</w:t>
-        <w:br/>
-        <w:t>│   │   │   │   │   │   ├── [id]</w:t>
-        <w:br/>
-        <w:t>│   │   │   │   │   │   │   ├── documents</w:t>
-        <w:br/>
-        <w:t>│   │   │   │   │   │   │   │   └── page.tsx</w:t>
-        <w:br/>
-        <w:t>│   │   │   │   │   │   │   ├── edit</w:t>
-        <w:br/>
-        <w:t>│   │   │   │   │   │   │   │   └── page.tsx</w:t>
-        <w:br/>
-        <w:t>│   │   │   │   │   │   │   ├── preview</w:t>
-        <w:br/>
-        <w:t>│   │   │   │   │   │   │   │   └── page.tsx</w:t>
-        <w:br/>
-        <w:t>│   │   │   │   │   │   │   └── version-history</w:t>
-        <w:br/>
-        <w:t>│   │   │   │   │   │   │       └── page.tsx</w:t>
-        <w:br/>
-        <w:t>│   │   │   │   │   │   └── create</w:t>
-        <w:br/>
-        <w:t>│   │   │   │   │   │       └── page.tsx</w:t>
-        <w:br/>
-        <w:t>│   │   │   │   │   ├── quotes</w:t>
-        <w:br/>
-        <w:t>│   │   │   │   │   │   ├── [id]</w:t>
-        <w:br/>
-        <w:t>│   │   │   │   │   │   │   ├── approval</w:t>
-        <w:br/>
-        <w:t>│   │   │   │   │   │   │   │   └── page.tsx</w:t>
-        <w:br/>
-        <w:t>│   │   │   │   │   │   │   ├── cost-breakdown</w:t>
-        <w:br/>
-        <w:t>│   │   │   │   │   │   │   │   └── page.tsx</w:t>
-        <w:br/>
-        <w:t>│   │   │   │   │   │   │   ├── edit</w:t>
-        <w:br/>
-        <w:t>│   │   │   │   │   │   │   │   └── page.tsx</w:t>
-        <w:br/>
-        <w:t>│   │   │   │   │   │   │   └── revisions</w:t>
-        <w:br/>
-        <w:t>│   │   │   │   │   │   │       └── page.tsx</w:t>
-        <w:br/>
-        <w:t>│   │   │   │   │   │   └── create</w:t>
-        <w:br/>
-        <w:t>│   │   │   │   │   │       └── page.tsx</w:t>
-        <w:br/>
-        <w:t>│   │   │   │   │   ├── reports</w:t>
-        <w:br/>
-        <w:t>│   │   │   │   │   │   ├── analytics</w:t>
-        <w:br/>
-        <w:t>│   │   │   │   │   │   │   └── page.tsx</w:t>
-        <w:br/>
-        <w:t>│   │   │   │   │   │   └── exports</w:t>
-        <w:br/>
-        <w:t>│   │   │   │   │   │       └── page.tsx</w:t>
-        <w:br/>
-        <w:t>│   │   │   │   │   ├── security</w:t>
-        <w:br/>
-        <w:t>│   │   │   │   │   │   ├── audit</w:t>
-        <w:br/>
-        <w:t>│   │   │   │   │   │   │   └── page.tsx</w:t>
-        <w:br/>
-        <w:t>│   │   │   │   │   │   ├── events</w:t>
-        <w:br/>
-        <w:t>│   │   │   │   │   │   │   └── page.tsx</w:t>
-        <w:br/>
-        <w:t>│   │   │   │   │   │   ├── impersonation</w:t>
-        <w:br/>
-        <w:t>│   │   │   │   │   │   │   └── page.tsx</w:t>
-        <w:br/>
-        <w:t>│   │   │   │   │   │   └── users</w:t>
-        <w:br/>
-        <w:t>│   │   │   │   │   │       └── page.tsx</w:t>
-        <w:br/>
-        <w:t>│   │   │   │   │   ├── service-requests</w:t>
-        <w:br/>
-        <w:t>│   │   │   │   │   │   ├── [id]</w:t>
-        <w:br/>
-        <w:t>│   │   │   │   │   │   │   ├── requirements</w:t>
-        <w:br/>
-        <w:t>│   │   │   │   │   │   │   │   └── page.tsx</w:t>
-        <w:br/>
-        <w:t>│   │   │   │   │   │   │   ├── resource-planning</w:t>
-        <w:br/>
-        <w:t>│   │   │   │   │   │   │   │   └── page.tsx</w:t>
-        <w:br/>
-        <w:t>│   │   │   │   │   │   │   └── page.tsx</w:t>
-        <w:br/>
-        <w:t>│   │   │   │   │   │   └── page.tsx</w:t>
-        <w:br/>
-        <w:t>│   │   │   │   │   ├── settings</w:t>
-        <w:br/>
-        <w:t>│   │   │   │   │   │   ├── email-templates</w:t>
-        <w:br/>
-        <w:t>│   │   │   │   │   │   │   └── page.tsx</w:t>
-        <w:br/>
-        <w:t>│   │   │   │   │   │   ├── feature-catalog</w:t>
-        <w:br/>
-        <w:t>│   │   │   │   │   │   │   └── page.tsx</w:t>
-        <w:br/>
-        <w:t>│   │   │   │   │   │   ├── general</w:t>
-        <w:br/>
-        <w:t>│   │   │   │   │   │   │   └── page.tsx</w:t>
-        <w:br/>
-        <w:t>│   │   │   │   │   │   ├── security</w:t>
-        <w:br/>
-        <w:t>│   │   │   │   │   │   │   └── page.tsx</w:t>
-        <w:br/>
-        <w:t>│   │   │   │   │   │   └── page.tsx</w:t>
-        <w:br/>
-        <w:t>│   │   │   │   │   ├── support</w:t>
-        <w:br/>
-        <w:t>│   │   │   │   │   │   ├── sla</w:t>
-        <w:br/>
-        <w:t>│   │   │   │   │   │   │   └── page.tsx</w:t>
-        <w:br/>
-        <w:t>│   │   │   │   │   │   ├── tickets</w:t>
-        <w:br/>
-        <w:t>│   │   │   │   │   │   │   ├── [ticketId]</w:t>
-        <w:br/>
-        <w:t>│   │   │   │   │   │   │   │   └── page.tsx</w:t>
-        <w:br/>
-        <w:t>│   │   │   │   │   │   │   └── page.tsx</w:t>
-        <w:br/>
-        <w:t>│   │   │   │   │   │   └── page.tsx</w:t>
         <w:br/>
         <w:t>│   │   │   │   │   └── layout.tsx</w:t>
         <w:br/>

</xml_diff>